<commit_message>
storing data in json file using fast api
</commit_message>
<xml_diff>
--- a/daily task.docx
+++ b/daily task.docx
@@ -13,106 +13,24 @@
       </w:r>
     </w:p>
     <w:p>
-      <w:proofErr w:type="gramStart"/>
-      <w:r>
-        <w:t>Series( how</w:t>
-      </w:r>
-      <w:proofErr w:type="gramEnd"/>
-      <w:r>
-        <w:t xml:space="preserve"> to create a </w:t>
-      </w:r>
-      <w:proofErr w:type="gramStart"/>
-      <w:r>
-        <w:t>series,  how</w:t>
-      </w:r>
-      <w:proofErr w:type="gramEnd"/>
-      <w:r>
-        <w:t xml:space="preserve"> to add condition on a </w:t>
-      </w:r>
-      <w:proofErr w:type="gramStart"/>
-      <w:r>
-        <w:t>series,  changing</w:t>
-      </w:r>
-      <w:proofErr w:type="gramEnd"/>
-      <w:r>
-        <w:t xml:space="preserve"> indexing in a </w:t>
-      </w:r>
-      <w:proofErr w:type="gramStart"/>
-      <w:r>
-        <w:t>series,  searching</w:t>
-      </w:r>
-      <w:proofErr w:type="gramEnd"/>
-      <w:r>
-        <w:t xml:space="preserve"> with location in series by label (</w:t>
-      </w:r>
-      <w:proofErr w:type="gramStart"/>
-      <w:r>
-        <w:t>loc[</w:t>
-      </w:r>
-      <w:proofErr w:type="gramEnd"/>
-      <w:r>
-        <w:t xml:space="preserve">]) and updating the </w:t>
-      </w:r>
-      <w:proofErr w:type="gramStart"/>
-      <w:r>
-        <w:t>value ,</w:t>
-      </w:r>
-      <w:proofErr w:type="gramEnd"/>
-      <w:r>
-        <w:t xml:space="preserve"> searching by </w:t>
-      </w:r>
-      <w:proofErr w:type="spellStart"/>
-      <w:proofErr w:type="gramStart"/>
-      <w:r>
-        <w:t>Iloc</w:t>
-      </w:r>
-      <w:proofErr w:type="spellEnd"/>
-      <w:r>
-        <w:t>[</w:t>
-      </w:r>
-      <w:proofErr w:type="gramEnd"/>
-      <w:r>
-        <w:t>], and then arithmetic location)</w:t>
+      <w:r>
+        <w:t>Series( how to create a series,  how to add condition on a series,  changing indexing in a series,  searching with location in series by label (loc[]) and updating the value , searching by Iloc[], and then arithmetic location)</w:t>
       </w:r>
     </w:p>
     <w:p/>
     <w:p>
-      <w:proofErr w:type="spellStart"/>
-      <w:proofErr w:type="gramStart"/>
-      <w:r>
-        <w:t>DataFrame</w:t>
-      </w:r>
-      <w:proofErr w:type="spellEnd"/>
-      <w:r>
-        <w:t>(</w:t>
-      </w:r>
-      <w:proofErr w:type="gramEnd"/>
-      <w:r>
-        <w:t xml:space="preserve">how to create data frame, </w:t>
-      </w:r>
-      <w:proofErr w:type="gramStart"/>
-      <w:r>
-        <w:t>Add</w:t>
-      </w:r>
-      <w:proofErr w:type="gramEnd"/>
-      <w:r>
-        <w:t xml:space="preserve"> new column, add new row, condition</w:t>
-      </w:r>
-      <w:r>
-        <w:t xml:space="preserve"> in data frame, Add multiple rows in </w:t>
-      </w:r>
-      <w:proofErr w:type="spellStart"/>
-      <w:r>
-        <w:t>dataframe</w:t>
-      </w:r>
-      <w:proofErr w:type="spellEnd"/>
+      <w:r>
+        <w:t>DataFrame(how to create data frame, Add new column, add new row, condition</w:t>
+      </w:r>
+      <w:r>
+        <w:t xml:space="preserve"> in data frame, Add multiple rows in dataframe</w:t>
+      </w:r>
       <w:r>
         <w:t>)</w:t>
       </w:r>
     </w:p>
     <w:p/>
     <w:p>
-      <w:proofErr w:type="gramStart"/>
       <w:r>
         <w:t>C</w:t>
       </w:r>
@@ -120,71 +38,25 @@
         <w:t>sv</w:t>
       </w:r>
       <w:r>
-        <w:t>(</w:t>
-      </w:r>
-      <w:proofErr w:type="gramEnd"/>
-      <w:r>
-        <w:t xml:space="preserve">read csv, display all rows, print single column, print multiple </w:t>
-      </w:r>
-      <w:proofErr w:type="gramStart"/>
-      <w:r>
-        <w:t>column</w:t>
-      </w:r>
-      <w:proofErr w:type="gramEnd"/>
+        <w:t>(read csv, display all rows, print single column, print multiple column</w:t>
+      </w:r>
       <w:r>
         <w:t>, input and search, slice operator,</w:t>
       </w:r>
       <w:r>
         <w:t xml:space="preserve"> Condition base row display using </w:t>
       </w:r>
-      <w:proofErr w:type="spellStart"/>
-      <w:proofErr w:type="gramStart"/>
-      <w:r>
-        <w:t>df.loc</w:t>
-      </w:r>
-      <w:proofErr w:type="spellEnd"/>
-      <w:r>
-        <w:t>[</w:t>
-      </w:r>
-      <w:proofErr w:type="gramEnd"/>
-      <w:r>
-        <w:t>1:20:2,0:3]</w:t>
-      </w:r>
-      <w:r>
-        <w:t xml:space="preserve">, changing index of to the name column and taking input of that column and then searching it, </w:t>
-      </w:r>
-      <w:proofErr w:type="gramStart"/>
-      <w:r>
-        <w:t>Filtering{</w:t>
-      </w:r>
-      <w:proofErr w:type="gramEnd"/>
-      <w:r>
-        <w:t xml:space="preserve">conditions, &amp;, </w:t>
-      </w:r>
-      <w:proofErr w:type="gramStart"/>
-      <w:r>
-        <w:t>| }</w:t>
-      </w:r>
-      <w:proofErr w:type="gramEnd"/>
-      <w:r>
-        <w:t>, aggregate function (</w:t>
-      </w:r>
-      <w:proofErr w:type="spellStart"/>
-      <w:r>
-        <w:t>GroupBy</w:t>
-      </w:r>
-      <w:proofErr w:type="spellEnd"/>
-      <w:r>
-        <w:t xml:space="preserve">, sum, min, max, </w:t>
-      </w:r>
-      <w:proofErr w:type="spellStart"/>
-      <w:proofErr w:type="gramStart"/>
-      <w:r>
-        <w:t>count,std</w:t>
-      </w:r>
-      <w:proofErr w:type="spellEnd"/>
-      <w:r>
-        <w:t xml:space="preserve">) </w:t>
+      <w:r>
+        <w:t>df.loc[1:20:2,0:3]</w:t>
+      </w:r>
+      <w:r>
+        <w:t xml:space="preserve">, changing index of to the name column and taking input of that column and then searching it, Filtering{conditions, &amp;, | }, aggregate function (GroupBy, sum, min, max, count,std) </w:t>
+      </w:r>
+      <w:r>
+        <w:t>, drop</w:t>
+      </w:r>
+      <w:r>
+        <w:t xml:space="preserve"> (), dropna(), fillna()</w:t>
       </w:r>
       <w:r>
         <w:t xml:space="preserve"> </w:t>
@@ -192,7 +64,19 @@
       <w:r>
         <w:t>)</w:t>
       </w:r>
-      <w:proofErr w:type="gramEnd"/>
+    </w:p>
+    <w:p/>
+    <w:p/>
+    <w:p/>
+    <w:p>
+      <w:r>
+        <w:t xml:space="preserve">Day2 </w:t>
+      </w:r>
+    </w:p>
+    <w:p>
+      <w:r>
+        <w:t xml:space="preserve">Fast API, practice the Fast Api, created a json file and add info in it using fast API,  </w:t>
+      </w:r>
     </w:p>
     <w:sectPr>
       <w:pgSz w:w="12240" w:h="15840"/>

</xml_diff>